<commit_message>
Redraw Module 7 figures as plain sharp-edged line art
Drops the hand-drawn sketch wobble entirely. Figures are now straight lines,
square corners, white fills and a single diagonal hatch for machined solid,
with orthogonal connectors throughout.

Also removes the generated-looking details: random stipple texture on the
elastomer cover becomes a regular dot hatch, smooth bezier tendon routes
become orthogonal polylines, concentric fingerprint arcs are gone, grey
decorative fills are gone, and the mounting bosses and electrodes are plain
squares. Fixes the wrist rotator arrow hidden behind its circle and routes
the wrist-roll leader clear of the cuff.

Co-Authored-By: Claude Opus 5 <noreply@anthropic.com>
Claude-Session: https://claude.ai/code/session_01Pr1KZUwJKr1SG7VKRTVf7C
</commit_message>
<xml_diff>
--- a/module-07/Module_07_Assignment_Concept_Generation.docx
+++ b/module-07/Module_07_Assignment_Concept_Generation.docx
@@ -470,7 +470,7 @@
       <w:r>
         <w:drawing>
           <wp:inline xmlns:a="http://schemas.openxmlformats.org/drawingml/2006/main" xmlns:pic="http://schemas.openxmlformats.org/drawingml/2006/picture">
-            <wp:extent cx="5760720" cy="4158436"/>
+            <wp:extent cx="5760720" cy="4139680"/>
             <wp:docPr id="2" name="Picture 2"/>
             <wp:cNvGraphicFramePr>
               <a:graphicFrameLocks noChangeAspect="1"/>
@@ -491,7 +491,7 @@
                   <pic:spPr>
                     <a:xfrm>
                       <a:off x="0" y="0"/>
-                      <a:ext cx="5760720" cy="4158436"/>
+                      <a:ext cx="5760720" cy="4139680"/>
                     </a:xfrm>
                     <a:prstGeom prst="rect"/>
                   </pic:spPr>

</xml_diff>